<commit_message>
Add Substack, writing section, updated resume
</commit_message>
<xml_diff>
--- a/Sara_Nazari_Resume.docx
+++ b/Sara_Nazari_Resume.docx
@@ -241,6 +241,24 @@
           </w:p>
           <w:p>
             <w:pPr>
+              <w:spacing w:after="40" w:before="0"/>
+              <w:jc w:val="left"/>
+            </w:pPr>
+            <w:r>
+              <w:rPr>
+                <w:rFonts w:ascii="Arial" w:cs="Arial" w:eastAsia="Arial" w:hAnsi="Arial"/>
+                <w:b w:val="false"/>
+                <w:bCs w:val="false"/>
+                <w:caps w:val="false"/>
+                <w:color w:val="4D96FF"/>
+                <w:sz w:val="16"/>
+                <w:szCs w:val="16"/>
+              </w:rPr>
+              <w:t xml:space="preserve">substack.com/@saranazari</w:t>
+            </w:r>
+          </w:p>
+          <w:p>
+            <w:pPr>
               <w:spacing w:after="0" w:before="300"/>
             </w:pPr>
           </w:p>
@@ -521,24 +539,6 @@
                 <w:szCs w:val="17"/>
               </w:rPr>
               <w:t xml:space="preserve">English — Fluent</w:t>
-            </w:r>
-          </w:p>
-          <w:p>
-            <w:pPr>
-              <w:spacing w:after="40" w:before="0"/>
-              <w:jc w:val="left"/>
-            </w:pPr>
-            <w:r>
-              <w:rPr>
-                <w:rFonts w:ascii="Arial" w:cs="Arial" w:eastAsia="Arial" w:hAnsi="Arial"/>
-                <w:b w:val="false"/>
-                <w:bCs w:val="false"/>
-                <w:caps w:val="false"/>
-                <w:color w:val="E8E8F0"/>
-                <w:sz w:val="17"/>
-                <w:szCs w:val="17"/>
-              </w:rPr>
-              <w:t xml:space="preserve">French — Fluent</w:t>
             </w:r>
           </w:p>
           <w:p>

</xml_diff>